<commit_message>
docs: complete Darukaa hackathon submission package
Update README and submission notes with the fully re-verified status:
Docker Compose now runs end-to-end (health check, /docs, evidence
search, Sundarbans assessment, and the clarifying-question flow all
confirmed against the live containers), all 17 knowledge base sources
individually URL-verified, and the Vercel frontend confirmed live.
Backend remains deploy-ready via render.yaml but undeployed, since no
Render credentials are available in this build environment; the exact
remaining steps are documented. Regenerate
Darukaa_Earth_Hackathon_Submission.docx to match.

Co-Authored-By: Claude Sonnet 5 <noreply@anthropic.com>
</commit_message>
<xml_diff>
--- a/Darukaa_Earth_Hackathon_Submission.docx
+++ b/Darukaa_Earth_Hackathon_Submission.docx
@@ -125,7 +125,71 @@
     </w:p>
     <w:p>
       <w:r>
-        <w:t>The backend (FastAPI + PostgreSQL/SQLite + ChromaDB) is fully deploy-ready — backend/Dockerfile builds and runs correctly and render.yaml at the repository root lets Render provision the web service and PostgreSQL database automatically via Dashboard -&gt; New -&gt; Blueprint -&gt; select this repository. It was not deployed to Render from the automated build environment because no Render account credentials were available there. Everything the backend needs to run correctly has instead been verified locally end-to-end: health check, the full Sundarbans sample assessment producing cited, ranked recommendations, the clarifying-question chat flow, the full backend test suite (38/38 passing), and `docker compose up --build`. Once deployed on Render, set VITE_API_BASE_URL on the Vercel project to the new backend URL and redeploy the frontend; see README.md section 10 for the exact steps.</w:t>
+        <w:t>The backend (FastAPI + PostgreSQL/SQLite + ChromaDB) is fully deploy-ready — backend/Dockerfile builds and runs correctly and render.yaml at the repository root lets Render provision the web service and PostgreSQL database automatically via Dashboard -&gt; New -&gt; Blueprint -&gt; select this repository. It was not deployed to Render from the automated build environment because no Render account credentials were available there. Everything the backend needs to run correctly has instead been verified end-to-end, including a full docker compose up --build run with all three containers (db, backend, frontend) reaching a healthy state: health check, /docs, /api/evidence/search, the full Sundarbans sample assessment producing cited, ranked recommendations, and the clarifying-question chat flow all responded correctly against the running Docker stack. Once deployed on Render, set VITE_API_BASE_URL on the Vercel project to the new backend URL and redeploy the frontend; see README.md section 10 for the exact steps.</w:t>
+      </w:r>
+    </w:p>
+    <w:p>
+      <w:pPr>
+        <w:pStyle w:val="Heading1"/>
+      </w:pPr>
+      <w:r>
+        <w:t>Verified test results</w:t>
+      </w:r>
+    </w:p>
+    <w:p>
+      <w:pPr>
+        <w:pStyle w:val="ListBullet"/>
+      </w:pPr>
+      <w:r>
+        <w:t>Backend tests: pytest -v in backend/ -&gt; 38 passed, 0 failed.</w:t>
+      </w:r>
+    </w:p>
+    <w:p>
+      <w:pPr>
+        <w:pStyle w:val="ListBullet"/>
+      </w:pPr>
+      <w:r>
+        <w:t>Frontend tests: npm test in frontend/ -&gt; 15 passed, 0 failed (3 test files).</w:t>
+      </w:r>
+    </w:p>
+    <w:p>
+      <w:pPr>
+        <w:pStyle w:val="ListBullet"/>
+      </w:pPr>
+      <w:r>
+        <w:t>Frontend production build: npm run build -&gt; succeeds.</w:t>
+      </w:r>
+    </w:p>
+    <w:p>
+      <w:pPr>
+        <w:pStyle w:val="ListBullet"/>
+      </w:pPr>
+      <w:r>
+        <w:t>Docker Compose: all three containers healthy/running; /api/health, /docs, and /api/evidence/search verified against the live containers.</w:t>
+      </w:r>
+    </w:p>
+    <w:p>
+      <w:pPr>
+        <w:pStyle w:val="ListBullet"/>
+      </w:pPr>
+      <w:r>
+        <w:t>Sundarbans sample end-to-end: biodiversity_risk_level "critical", confidence 0.9, 14 variables considered, 5 multi-metric rules activated, 7 ranked recommendations, every recommendation citing real FAO/IPCC/UNEP/CBD/IUCN sources with working links.</w:t>
+      </w:r>
+    </w:p>
+    <w:p>
+      <w:pPr>
+        <w:pStyle w:val="ListBullet"/>
+      </w:pPr>
+      <w:r>
+        <w:t>Clarifying-question flow: a vague message ("Biodiversity is declining on my land.") returns exactly 3 focused follow-up questions and no fabricated assessment.</w:t>
+      </w:r>
+    </w:p>
+    <w:p>
+      <w:pPr>
+        <w:pStyle w:val="ListBullet"/>
+      </w:pPr>
+      <w:r>
+        <w:t>Evidence source audit: all 17 seed source URLs individually verified live (HTTP 200) with content matching their paraphrased claim; stale/moved URLs were corrected.</w:t>
       </w:r>
     </w:p>
     <w:p>

</xml_diff>

<commit_message>
docs: add verified production backend and demo URLs
Backend is now live on Render: https://ecorestore-intelligence-backend-mzdz.onrender.com
(free Docker web service + fresh free-tier PostgreSQL, deployed via
the Render API from render.yaml's configuration). Frontend redeployed
on Vercel with VITE_API_BASE_URL pointed at the live backend. Update
README, submission notes, and the Word document with the verified
live URLs and end-to-end verification results: health check, /docs,
evidence search, the full Sundarbans assessment (critical risk, 5
rules, 7 cited recommendations), and a CORS preflight from the Vercel
origin, all confirmed against the live deployment.

Co-Authored-By: Claude Sonnet 5 <noreply@anthropic.com>
</commit_message>
<xml_diff>
--- a/Darukaa_Earth_Hackathon_Submission.docx
+++ b/Darukaa_Earth_Hackathon_Submission.docx
@@ -109,7 +109,7 @@
           </w:tcPr>
           <w:p>
             <w:r>
-              <w:t>Not yet deployed — see 'Backend deployment' note below  ·  &lt;backend URL&gt;/docs once deployed (see note below)</w:t>
+              <w:t>https://ecorestore-intelligence-backend-mzdz.onrender.com  ·  https://ecorestore-intelligence-backend-mzdz.onrender.com/docs</w:t>
             </w:r>
           </w:p>
         </w:tc>
@@ -120,12 +120,12 @@
         <w:pStyle w:val="Heading1"/>
       </w:pPr>
       <w:r>
-        <w:t>Backend deployment status</w:t>
+        <w:t>Deployment status</w:t>
       </w:r>
     </w:p>
     <w:p>
       <w:r>
-        <w:t>The backend (FastAPI + PostgreSQL/SQLite + ChromaDB) is fully deploy-ready — backend/Dockerfile builds and runs correctly and render.yaml at the repository root lets Render provision the web service and PostgreSQL database automatically via Dashboard -&gt; New -&gt; Blueprint -&gt; select this repository. It was not deployed to Render from the automated build environment because no Render account credentials were available there. Everything the backend needs to run correctly has instead been verified end-to-end, including a full docker compose up --build run with all three containers (db, backend, frontend) reaching a healthy state: health check, /docs, /api/evidence/search, the full Sundarbans sample assessment producing cited, ranked recommendations, and the clarifying-question chat flow all responded correctly against the running Docker stack. Once deployed on Render, set VITE_API_BASE_URL on the Vercel project to the new backend URL and redeploy the frontend; see README.md section 10 for the exact steps.</w:t>
+        <w:t>Both the frontend (Vercel) and backend (Render, deployed via the Render API using render.yaml's configuration: a free Docker web service plus a fresh free-tier PostgreSQL database) are live and verified end-to-end against their public URLs. Render's free web service plan caps memory at 512MB, which cannot fit the full Sentence-Transformers/torch model at startup, so the deployed backend runs with EMBEDDING_BACKEND=hash -- the app's built-in deterministic fallback embedding -- instead of the full semantic model. The deterministic multi-metric reasoning engine, evidence citations, and every other feature are unaffected; local development and Docker Compose use the full semantic model by default.</w:t>
       </w:r>
     </w:p>
     <w:p>
@@ -173,7 +173,23 @@
         <w:pStyle w:val="ListBullet"/>
       </w:pPr>
       <w:r>
-        <w:t>Sundarbans sample end-to-end: biodiversity_risk_level "critical", confidence 0.9, 14 variables considered, 5 multi-metric rules activated, 7 ranked recommendations, every recommendation citing real FAO/IPCC/UNEP/CBD/IUCN sources with working links.</w:t>
+        <w:t>Live Render backend: GET /api/health -&gt; database_ok true, vector_store_ok true, evidence_chunks_indexed 34; /docs renders; /api/evidence/search returns real cited results; a CORS preflight from the Vercel origin succeeds.</w:t>
+      </w:r>
+    </w:p>
+    <w:p>
+      <w:pPr>
+        <w:pStyle w:val="ListBullet"/>
+      </w:pPr>
+      <w:r>
+        <w:t>Live Vercel frontend: redeployed with VITE_API_BASE_URL pointed at the live Render backend; the deployed JS bundle was fetched and confirmed to call that exact URL.</w:t>
+      </w:r>
+    </w:p>
+    <w:p>
+      <w:pPr>
+        <w:pStyle w:val="ListBullet"/>
+      </w:pPr>
+      <w:r>
+        <w:t>Sundarbans sample end-to-end (verified against the live Render backend): biodiversity_risk_level "critical", confidence 0.9, 14 variables considered, 5 multi-metric rules activated, 7 ranked recommendations, every recommendation citing real FAO/IPCC/UNEP/CBD/IUCN sources with working links.</w:t>
       </w:r>
     </w:p>
     <w:p>
@@ -303,16 +319,11 @@
       </w:r>
     </w:p>
     <w:p>
-      <w:r>
-        <w:t>Until the backend is deployed on Render (see status above), run it locally with Docker for the fullest review: `docker compose up --build` from the repository root, then use the deployed frontend below with VITE_API_BASE_URL pointed at http://localhost:8000 (or run `npm run dev` in frontend/ against the local backend). Once Render deployment is completed, the deployed frontend link works standalone end-to-end.</w:t>
-      </w:r>
-    </w:p>
-    <w:p>
       <w:pPr>
         <w:pStyle w:val="ListNumber"/>
       </w:pPr>
       <w:r>
-        <w:t>1. Open the deployed demo (frontend URL above), or run locally per the note above.</w:t>
+        <w:t>1. Open the live demo (frontend URL above).</w:t>
       </w:r>
     </w:p>
     <w:p>
@@ -336,7 +347,7 @@
         <w:pStyle w:val="ListNumber"/>
       </w:pPr>
       <w:r>
-        <w:t>4. Open the backend's /docs endpoint (http://localhost:8000/docs locally, or the Render URL once deployed) to test the REST API directly, including POST /api/assessments and GET /api/evidence/search.</w:t>
+        <w:t>4. Open the backend's /docs endpoint (URL above) to test the REST API directly, including POST /api/assessments and GET /api/evidence/search.</w:t>
       </w:r>
     </w:p>
     <w:sectPr>

</xml_diff>